<commit_message>
docs: actualizar Avances.docx y Entidades.docx con la remediación del Hito Alfa
- Avances: stack sin Hypersistence, 25 tests, gaps resueltos (demo 45/45 y CI),
  y nueva sección 12 con el resumen de hardening/optimización.
- Entidades: entidad RevokedToken, note de tipos nativos, PageResponse y
  migraciones V14-V16.
</commit_message>
<xml_diff>
--- a/Avances.docx
+++ b/Avances.docx
@@ -69,7 +69,7 @@
         <w:pStyle w:val="ListBullet"/>
       </w:pPr>
       <w:r>
-        <w:t>13 tests en verde (7 no negociables + tests de controller/CRUD), contra PostgreSQL real vía Testcontainers.</w:t>
+        <w:t>25 tests en verde (7 no negociables + tests de controller/CRUD), contra PostgreSQL real vía Testcontainers.</w:t>
       </w:r>
     </w:p>
     <w:p>
@@ -123,7 +123,7 @@
         <w:pStyle w:val="ListBullet"/>
       </w:pPr>
       <w:r>
-        <w:t>Spring Data JPA + Hibernate 6.6 · Hypersistence Utils (TEXT[] / JSONB)</w:t>
+        <w:t>Spring Data JPA + Hibernate 6.6 · Hibernate 6.6 nativo (@JdbcTypeCode/@Convert para TEXT[] y JSONB)</w:t>
       </w:r>
     </w:p>
     <w:p>
@@ -297,7 +297,7 @@
         <w:pStyle w:val="ListBullet"/>
       </w:pPr>
       <w:r>
-        <w:t>Fase 9 — Test: 7 tests no negociables + controller/CRUD = 13 tests en verde.</w:t>
+        <w:t>Fase 9 — Test: 7 tests no negociables + controller/CRUD = 25 tests en verde.</w:t>
       </w:r>
     </w:p>
     <w:p>
@@ -498,7 +498,7 @@
         <w:pStyle w:val="ListBullet"/>
       </w:pPr>
       <w:r>
-        <w:t>ddl-auto: none (validate rompe con Hypersistence TEXT[]/JSONB por _text vs text[]); Flyway gestiona el schema.</w:t>
+        <w:t>ddl-auto: none (con Hypersistence eliminado, se mantiene none porque Flyway gestiona el schema; validate queda opcional).</w:t>
       </w:r>
     </w:p>
     <w:p>
@@ -549,7 +549,7 @@
         <w:pStyle w:val="ListBullet"/>
       </w:pPr>
       <w:r>
-        <w:t>Demo punta a punta: el código y el seed están listos; falta ejecutar el flujo end-to-end con el stack levantado.</w:t>
+        <w:t>RESUELTO — Demo punta a punta: ejecutado el flujo end-to-end con el stack levantado (docs/demo-punta-a-punta.py, 45/45 pasos OK en todos los roles).</w:t>
       </w:r>
     </w:p>
     <w:p>
@@ -557,7 +557,7 @@
         <w:pStyle w:val="ListBullet"/>
       </w:pPr>
       <w:r>
-        <w:t>CI: workflow creado (.github/workflows/ci.yml); falta verificar la primera corrida en GitHub.</w:t>
+        <w:t>RESUELTO — CI: workflow (.github/workflows/ci.yml) verificado con 6+ corridas verdes en GitHub Actions.</w:t>
       </w:r>
     </w:p>
     <w:p>
@@ -565,7 +565,7 @@
         <w:pStyle w:val="ListBullet"/>
       </w:pPr>
       <w:r>
-        <w:t>Webhook de pagos (POST /payments/webhook/{provider}): declarado MVP (flujo QR/cliente + firma HMAC de gateways).</w:t>
+        <w:t>Webhook de pagos (POST /payments/webhook/{provider}): el permitAll fue eliminado y el endpoint queda declarado MVP (flujo QR/cliente + firma HMAC de gateways).</w:t>
       </w:r>
     </w:p>
     <w:p>
@@ -671,6 +671,140 @@
           <w:b w:val="0"/>
         </w:rPr>
         <w:t>El Hito Alfa quedó implementado en su totalidad a nivel de código: 9 fases, 6 reglas no negociables respetadas, 3 vulnerabilidades críticas cerradas de forma verificable y el front demo conectado al backend. Resta el cierre operativo (demo punta a punta y primera corrida del CI) para dar por cerrado el hito con el Definition of Done completo.</w:t>
+      </w:r>
+    </w:p>
+    <w:p>
+      <w:pPr>
+        <w:pStyle w:val="Heading1"/>
+      </w:pPr>
+      <w:r>
+        <w:t>12. Cierre del Hito Alfa — remediación, hardening y optimización (1 sep 2026)</w:t>
+      </w:r>
+    </w:p>
+    <w:p>
+      <w:pPr>
+        <w:pStyle w:val="ListBullet"/>
+      </w:pPr>
+      <w:r>
+        <w:rPr>
+          <w:b/>
+        </w:rPr>
+        <w:t>Seguridad JWT:</w:t>
+      </w:r>
+      <w:r>
+        <w:t xml:space="preserve"> validación de expiración en el filtro; claim `type` (access/refresh); `/refresh` valida tipo+expiración+jti no revocado y ROTA el refresh token; `/logout` revoca (denylist `jti` en tabla `revoked_token`, migración V14).</w:t>
+      </w:r>
+    </w:p>
+    <w:p>
+      <w:pPr>
+        <w:pStyle w:val="ListBullet"/>
+      </w:pPr>
+      <w:r>
+        <w:rPr>
+          <w:b/>
+        </w:rPr>
+        <w:t>Autorización:</w:t>
+      </w:r>
+      <w:r>
+        <w:t xml:space="preserve"> `getOrder` ahora aplica `enforceGuestSession` (cierre de fuga de datos GUEST entre mesas).</w:t>
+      </w:r>
+    </w:p>
+    <w:p>
+      <w:pPr>
+        <w:pStyle w:val="ListBullet"/>
+      </w:pPr>
+      <w:r>
+        <w:rPr>
+          <w:b/>
+        </w:rPr>
+        <w:t>Deuda de tipos:</w:t>
+      </w:r>
+      <w:r>
+        <w:t xml:space="preserve"> eliminada la dependencia Hypersistence; JSONB migrado a `@JdbcTypeCode(SqlTypes.JSON)` + converters Jackson (`OpeningHoursConverter`, `ModifierOptionListConverter`).</w:t>
+      </w:r>
+    </w:p>
+    <w:p>
+      <w:pPr>
+        <w:pStyle w:val="ListBullet"/>
+      </w:pPr>
+      <w:r>
+        <w:rPr>
+          <w:b/>
+        </w:rPr>
+        <w:t>Rendimiento:</w:t>
+      </w:r>
+      <w:r>
+        <w:t xml:space="preserve"> eliminados N+1 (getFloors/getSections/toGuest/createOrder) con queries batch y `saveAll`.</w:t>
+      </w:r>
+    </w:p>
+    <w:p>
+      <w:pPr>
+        <w:pStyle w:val="ListBullet"/>
+      </w:pPr>
+      <w:r>
+        <w:rPr>
+          <w:b/>
+        </w:rPr>
+        <w:t>Correctitud:</w:t>
+      </w:r>
+      <w:r>
+        <w:t xml:space="preserve"> `voidOrderLine` con event type condicional (pre/post cocina); `createSession` con `@Transactional` + índice único parcial (V15); fix de `authorizedName` en exception-log; WebSocket valida expiración y autoriza SUBSCRIBE por rol.</w:t>
+      </w:r>
+    </w:p>
+    <w:p>
+      <w:pPr>
+        <w:pStyle w:val="ListBullet"/>
+      </w:pPr>
+      <w:r>
+        <w:rPr>
+          <w:b/>
+        </w:rPr>
+        <w:t>API:</w:t>
+      </w:r>
+      <w:r>
+        <w:t xml:space="preserve"> paginación en `/bills`, `/kitchen/tickets` y `/exceptions` (`PageResponse&lt;T&gt;`).</w:t>
+      </w:r>
+    </w:p>
+    <w:p>
+      <w:pPr>
+        <w:pStyle w:val="ListBullet"/>
+      </w:pPr>
+      <w:r>
+        <w:rPr>
+          <w:b/>
+        </w:rPr>
+        <w:t>Hardening:</w:t>
+      </w:r>
+      <w:r>
+        <w:t xml:space="preserve"> rate-limit en login/PIN (429); CORS/WebSocket restringidos a localhost; secrets fail-fast (`.env` local + `.env.example` con placeholders).</w:t>
+      </w:r>
+    </w:p>
+    <w:p>
+      <w:pPr>
+        <w:pStyle w:val="ListBullet"/>
+      </w:pPr>
+      <w:r>
+        <w:rPr>
+          <w:b/>
+        </w:rPr>
+        <w:t>Limpieza:</w:t>
+      </w:r>
+      <w:r>
+        <w:t xml:space="preserve"> 12 métodos muertos eliminados; constantes TTL/service-charge centralizadas; helper `BranchScoping`; `permitAll` del webhook eliminado.</w:t>
+      </w:r>
+    </w:p>
+    <w:p>
+      <w:pPr>
+        <w:pStyle w:val="ListBullet"/>
+      </w:pPr>
+      <w:r>
+        <w:rPr>
+          <w:b/>
+        </w:rPr>
+        <w:t>Verificación:</w:t>
+      </w:r>
+      <w:r>
+        <w:t xml:space="preserve"> 25 tests verdes, CI verde, evidencia punta a punta 45/45.</w:t>
       </w:r>
     </w:p>
     <w:sectPr>

</xml_diff>

<commit_message>
docs: quitar referencias a @Auditable/AuditAspect en Avances.docx
La auditoría pasó de AOP a inline con contexto; se corrigen las 3 menciones
(regla 3, Fase 8 y test) para reflejar la eliminación del patrón AOP.
</commit_message>
<xml_diff>
--- a/Avances.docx
+++ b/Avances.docx
@@ -190,7 +190,7 @@
         <w:pStyle w:val="ListBullet"/>
       </w:pPr>
       <w:r>
-        <w:t>3. Anulación/descuento con PIN + @Auditable: @Auditable en voidOrderLine/applyDiscount/refund + AuditAspect que genera EXCEPTION_LOG.</w:t>
+        <w:t>3. Anulación/descuento/reembolso con PIN: voidOrderLine/applyDiscount/refund validan PIN y generan EXCEPTION_LOG persistente de forma inline (con reason, amount y authorizedBy).</w:t>
       </w:r>
     </w:p>
     <w:p>
@@ -289,7 +289,7 @@
         <w:pStyle w:val="ListBullet"/>
       </w:pPr>
       <w:r>
-        <w:t>Fase 8 — Transversales: SecurityFilterChain, JwtAuthFilter, GlobalExceptionHandler, AuditAspect, WebSocket, CORS, OpenAPI.</w:t>
+        <w:t>Fase 8 — Transversales: SecurityFilterChain, JwtAuthFilter, GlobalExceptionHandler, WebSocket, CORS, OpenAPI.</w:t>
       </w:r>
     </w:p>
     <w:p>
@@ -348,7 +348,7 @@
         <w:pStyle w:val="ListBullet"/>
       </w:pPr>
       <w:r>
-        <w:t>PinValidationServiceTest + AuditAspectIntegrationTest — PIN + EXCEPTION_LOG (vulnerabilidad #2)</w:t>
+        <w:t>PinValidationServiceTest + ApplyDiscountAuditIntegrationTest — PIN + EXCEPTION_LOG (vulnerabilidad #2)</w:t>
       </w:r>
     </w:p>
     <w:p>

</xml_diff>

<commit_message>
docs: actualizar Avances.docx y Entidades.docx con refactorizaciones finales
- Avances: nueva §13 (Dominio Rico, switch-branch, seguridad 3ª auditoría,
  auditoría inline, limpieza, 6 enums) y conteo de tests a 30.
- Entidades: métodos de dominio en Bill/Order/OrderLine, nota de auditoría
  inline, 6 enums nuevos y switch-branch en auth.
</commit_message>
<xml_diff>
--- a/Avances.docx
+++ b/Avances.docx
@@ -69,7 +69,7 @@
         <w:pStyle w:val="ListBullet"/>
       </w:pPr>
       <w:r>
-        <w:t>25 tests en verde (7 no negociables + tests de controller/CRUD), contra PostgreSQL real vía Testcontainers.</w:t>
+        <w:t>30 tests en verde (7 no negociables + tests de controller/CRUD), contra PostgreSQL real vía Testcontainers.</w:t>
       </w:r>
     </w:p>
     <w:p>
@@ -297,7 +297,7 @@
         <w:pStyle w:val="ListBullet"/>
       </w:pPr>
       <w:r>
-        <w:t>Fase 9 — Test: 7 tests no negociables + controller/CRUD = 25 tests en verde.</w:t>
+        <w:t>Fase 9 — Test: 7 tests no negociables + controller/CRUD = 30 tests en verde.</w:t>
       </w:r>
     </w:p>
     <w:p>
@@ -804,7 +804,113 @@
         <w:t>Verificación:</w:t>
       </w:r>
       <w:r>
-        <w:t xml:space="preserve"> 25 tests verdes, CI verde, evidencia punta a punta 45/45.</w:t>
+        <w:t xml:space="preserve"> 30 tests verdes, CI verde, evidencia punta a punta 45/45.</w:t>
+      </w:r>
+    </w:p>
+    <w:p>
+      <w:pPr>
+        <w:pStyle w:val="Heading1"/>
+      </w:pPr>
+      <w:r>
+        <w:t>13. Refactorizaciones finales de Alfa (1 sep 2026)</w:t>
+      </w:r>
+    </w:p>
+    <w:p>
+      <w:pPr>
+        <w:pStyle w:val="ListBullet"/>
+      </w:pPr>
+      <w:r>
+        <w:rPr>
+          <w:b/>
+        </w:rPr>
+        <w:t>Dominio Rico:</w:t>
+      </w:r>
+      <w:r>
+        <w:t xml:space="preserve"> la lógica de cálculo y cambio de estado vive en las entidades: Bill (applyServiceCharge, recomputeTotal, settleBalance, applyPayment, applyDiscount, isFullyPaid), Order (calculateTotals(List&lt;OrderLine&gt;)), OrderLine (calculateLineTotal, transitionTo, cancel, markCourseAsMarching). Los servicios solo orquestan repositorios y publican eventos.</w:t>
+      </w:r>
+    </w:p>
+    <w:p>
+      <w:pPr>
+        <w:pStyle w:val="ListBullet"/>
+      </w:pPr>
+      <w:r>
+        <w:rPr>
+          <w:b/>
+        </w:rPr>
+        <w:t>switch-branch:</w:t>
+      </w:r>
+      <w:r>
+        <w:t xml:space="preserve"> endpoint /auth/switch-branch emite un JWT definitivo con el branch_id elegido; AuthResponse incluye availableBranches ({branchId, branchName, role}). Resuelve el OWNER multi-sucursal.</w:t>
+      </w:r>
+    </w:p>
+    <w:p>
+      <w:pPr>
+        <w:pStyle w:val="ListBullet"/>
+      </w:pPr>
+      <w:r>
+        <w:rPr>
+          <w:b/>
+        </w:rPr>
+        <w:t>Seguridad (3ª auditoría):</w:t>
+      </w:r>
+      <w:r>
+        <w:t xml:space="preserve"> JwtAuthFilter ya no corta la cadena (token expirado → 401); la validación de PIN soporta múltiples managers (List + filtro ACTIVE); resolveRole compara companyId antes de otorgar SUPERADMIN; 3 endpoints de Bill con @PreAuthorize (excluye KITCHEN).</w:t>
+      </w:r>
+    </w:p>
+    <w:p>
+      <w:pPr>
+        <w:pStyle w:val="ListBullet"/>
+      </w:pPr>
+      <w:r>
+        <w:rPr>
+          <w:b/>
+        </w:rPr>
+        <w:t>Dominio + auditoría:</w:t>
+      </w:r>
+      <w:r>
+        <w:t xml:space="preserve"> OrderLine.transitionTo valida transiciones (bloquea revivir una línea CANCELLED); createLog persiste reason, amount, orderLineId y authorizedBy.</w:t>
+      </w:r>
+    </w:p>
+    <w:p>
+      <w:pPr>
+        <w:pStyle w:val="ListBullet"/>
+      </w:pPr>
+      <w:r>
+        <w:rPr>
+          <w:b/>
+        </w:rPr>
+        <w:t>Limpieza:</w:t>
+      </w:r>
+      <w:r>
+        <w:t xml:space="preserve"> eliminados @Auditable/AuditAspect (la auditoría es inline); colecciones inicializadas vacías (modifiers, tags, allergens, cuisineTags, allergies).</w:t>
+      </w:r>
+    </w:p>
+    <w:p>
+      <w:pPr>
+        <w:pStyle w:val="ListBullet"/>
+      </w:pPr>
+      <w:r>
+        <w:rPr>
+          <w:b/>
+        </w:rPr>
+        <w:t>6 enums nuevos (prep MVP):</w:t>
+      </w:r>
+      <w:r>
+        <w:t xml:space="preserve"> ChannelEnum (QR/STAFF/POS), SiiStatusEnum (ISSUED/PENDING/CONTINGENCY), ReservationStatusEnum, ServiceRequestStatusEnum (OPEN/ACCEPTED/RESOLVED), ServiceRequestTypeEnum (WAITER/BILL/WATER/OTHER), TaxDocumentTypeEnum (BOLETA/FACTURA).</w:t>
+      </w:r>
+    </w:p>
+    <w:p>
+      <w:pPr>
+        <w:pStyle w:val="ListBullet"/>
+      </w:pPr>
+      <w:r>
+        <w:rPr>
+          <w:b/>
+        </w:rPr>
+        <w:t>Tests:</w:t>
+      </w:r>
+      <w:r>
+        <w:t xml:space="preserve"> 30 en verde (antes 26), con Testcontainers real.</w:t>
       </w:r>
     </w:p>
     <w:sectPr>

</xml_diff>